<commit_message>
Videre arbeid på rapport
Må korte ned innledningen, har bare spydd ut informasjon til å begynne med
</commit_message>
<xml_diff>
--- a/Report and figures/Project report.docx
+++ b/Report and figures/Project report.docx
@@ -267,8 +267,17 @@
           <w:sz w:val="28"/>
           <w:szCs w:val="28"/>
         </w:rPr>
-        <w:t>Magne Svalland</w:t>
-      </w:r>
+        <w:t xml:space="preserve">Magne </w:t>
+      </w:r>
+      <w:proofErr w:type="spellStart"/>
+      <w:r>
+        <w:rPr>
+          <w:sz w:val="28"/>
+          <w:szCs w:val="28"/>
+        </w:rPr>
+        <w:t>Svalland</w:t>
+      </w:r>
+      <w:proofErr w:type="spellEnd"/>
       <w:r>
         <w:rPr>
           <w:sz w:val="28"/>
@@ -1151,14 +1160,87 @@
           <w:highlight w:val="yellow"/>
           <w:lang w:val="nb-NO"/>
         </w:rPr>
-        <w:t xml:space="preserve">Note to self: Husk å skriv noe om at DL (learned features) vil ha dårligere forklarbarhet enn </w:t>
-      </w:r>
+        <w:t xml:space="preserve">Note to </w:t>
+      </w:r>
+      <w:proofErr w:type="spellStart"/>
       <w:r>
         <w:rPr>
           <w:highlight w:val="yellow"/>
           <w:lang w:val="nb-NO"/>
         </w:rPr>
-        <w:t>handcrafted features, og at det derfor vil være behov for metoder for forklarbarhet som XAI</w:t>
+        <w:t>self</w:t>
+      </w:r>
+      <w:proofErr w:type="spellEnd"/>
+      <w:r>
+        <w:rPr>
+          <w:highlight w:val="yellow"/>
+          <w:lang w:val="nb-NO"/>
+        </w:rPr>
+        <w:t>: Husk å skriv noe om at DL (</w:t>
+      </w:r>
+      <w:proofErr w:type="spellStart"/>
+      <w:r>
+        <w:rPr>
+          <w:highlight w:val="yellow"/>
+          <w:lang w:val="nb-NO"/>
+        </w:rPr>
+        <w:t>learned</w:t>
+      </w:r>
+      <w:proofErr w:type="spellEnd"/>
+      <w:r>
+        <w:rPr>
+          <w:highlight w:val="yellow"/>
+          <w:lang w:val="nb-NO"/>
+        </w:rPr>
+        <w:t xml:space="preserve"> </w:t>
+      </w:r>
+      <w:proofErr w:type="spellStart"/>
+      <w:r>
+        <w:rPr>
+          <w:highlight w:val="yellow"/>
+          <w:lang w:val="nb-NO"/>
+        </w:rPr>
+        <w:t>features</w:t>
+      </w:r>
+      <w:proofErr w:type="spellEnd"/>
+      <w:r>
+        <w:rPr>
+          <w:highlight w:val="yellow"/>
+          <w:lang w:val="nb-NO"/>
+        </w:rPr>
+        <w:t xml:space="preserve">) vil ha dårligere forklarbarhet enn </w:t>
+      </w:r>
+      <w:proofErr w:type="spellStart"/>
+      <w:r>
+        <w:rPr>
+          <w:highlight w:val="yellow"/>
+          <w:lang w:val="nb-NO"/>
+        </w:rPr>
+        <w:t>handcrafted</w:t>
+      </w:r>
+      <w:proofErr w:type="spellEnd"/>
+      <w:r>
+        <w:rPr>
+          <w:highlight w:val="yellow"/>
+          <w:lang w:val="nb-NO"/>
+        </w:rPr>
+        <w:t xml:space="preserve"> </w:t>
+      </w:r>
+      <w:proofErr w:type="spellStart"/>
+      <w:r>
+        <w:rPr>
+          <w:highlight w:val="yellow"/>
+          <w:lang w:val="nb-NO"/>
+        </w:rPr>
+        <w:t>features</w:t>
+      </w:r>
+      <w:proofErr w:type="spellEnd"/>
+      <w:r>
+        <w:rPr>
+          <w:highlight w:val="yellow"/>
+          <w:lang w:val="nb-NO"/>
+        </w:rPr>
+        <w:t>, og at det derfor vil være behov for metoder for forklarbarhet som XAI</w:t>
       </w:r>
     </w:p>
     <w:p>
@@ -1295,13 +1377,7 @@
         <w:rPr>
           <w:rFonts w:ascii="Times New Roman" w:hAnsi="Times New Roman" w:cs="Times New Roman"/>
         </w:rPr>
-        <w:t xml:space="preserve">Chest radiography is one of the most widely used imaging modalities in modern medicine and plays a central role in the diagnosis of thoracic diseases. It is </w:t>
-      </w:r>
-      <w:r>
-        <w:rPr>
-          <w:rFonts w:ascii="Times New Roman" w:hAnsi="Times New Roman" w:cs="Times New Roman"/>
-        </w:rPr>
-        <w:t xml:space="preserve">typically the first imaging examination used for patients presenting with symptoms such as chest pain, shortness of breath or persistent cough </w:t>
+        <w:t xml:space="preserve">Chest radiography is one of the most widely used imaging modalities in modern medicine and plays a central role in the diagnosis of thoracic diseases. It is typically the first imaging examination used for patients presenting with symptoms such as chest pain, shortness of breath or persistent cough </w:t>
       </w:r>
       <w:sdt>
         <w:sdtPr>
@@ -1425,19 +1501,7 @@
         <w:rPr>
           <w:rFonts w:ascii="Times New Roman" w:hAnsi="Times New Roman" w:cs="Times New Roman"/>
         </w:rPr>
-        <w:t xml:space="preserve">Despite its importance, the interpretation of chest radiographs remains a challenging task. Klein and Rosado-de-Christenson explains that this is because </w:t>
-      </w:r>
-      <w:r>
-        <w:rPr>
-          <w:rFonts w:ascii="Times New Roman" w:hAnsi="Times New Roman" w:cs="Times New Roman"/>
-        </w:rPr>
-        <w:t xml:space="preserve">of </w:t>
-      </w:r>
-      <w:r>
-        <w:rPr>
-          <w:rFonts w:ascii="Times New Roman" w:hAnsi="Times New Roman" w:cs="Times New Roman"/>
-        </w:rPr>
-        <w:t xml:space="preserve">“The superimposition of complex structures of various radiographic density (gas, water, calcium, metal and fat) </w:t>
+        <w:t xml:space="preserve">Despite its importance, the interpretation of chest radiographs remains a challenging task. Klein and Rosado-de-Christenson explains that this is because of “The superimposition of complex structures of various radiographic density (gas, water, calcium, metal and fat) </w:t>
       </w:r>
       <w:sdt>
         <w:sdtPr>
@@ -1497,19 +1561,7 @@
         <w:rPr>
           <w:rFonts w:ascii="Times New Roman" w:hAnsi="Times New Roman" w:cs="Times New Roman"/>
         </w:rPr>
-        <w:t>dimensional anatomical structures onto a two-dimensional image,</w:t>
-      </w:r>
-      <w:r>
-        <w:rPr>
-          <w:rFonts w:ascii="Times New Roman" w:hAnsi="Times New Roman" w:cs="Times New Roman"/>
-        </w:rPr>
-        <w:t xml:space="preserve"> and the subtle nature of many pathological findings makes this </w:t>
-      </w:r>
-      <w:r>
-        <w:rPr>
-          <w:rFonts w:ascii="Times New Roman" w:hAnsi="Times New Roman" w:cs="Times New Roman"/>
-        </w:rPr>
-        <w:t xml:space="preserve">one of the most difficult radiographs to interpret </w:t>
+        <w:t xml:space="preserve">dimensional anatomical structures onto a two-dimensional image, and the subtle nature of many pathological findings makes this one of the most difficult radiographs to interpret </w:t>
       </w:r>
       <w:sdt>
         <w:sdtPr>
@@ -1583,55 +1635,7 @@
         <w:rPr>
           <w:rFonts w:ascii="Times New Roman" w:hAnsi="Times New Roman" w:cs="Times New Roman"/>
         </w:rPr>
-        <w:t xml:space="preserve">, there is a growing need for automated systems that can assist clinicians in </w:t>
-      </w:r>
-      <w:r>
-        <w:rPr>
-          <w:rFonts w:ascii="Times New Roman" w:hAnsi="Times New Roman" w:cs="Times New Roman"/>
-        </w:rPr>
-        <w:t>interpreting these images.</w:t>
-      </w:r>
-      <w:r>
-        <w:rPr>
-          <w:rFonts w:ascii="Times New Roman" w:hAnsi="Times New Roman" w:cs="Times New Roman"/>
-        </w:rPr>
-        <w:t xml:space="preserve"> There already </w:t>
-      </w:r>
-      <w:r>
-        <w:rPr>
-          <w:rFonts w:ascii="Times New Roman" w:hAnsi="Times New Roman" w:cs="Times New Roman"/>
-        </w:rPr>
-        <w:t>exist</w:t>
-      </w:r>
-      <w:r>
-        <w:rPr>
-          <w:rFonts w:ascii="Times New Roman" w:hAnsi="Times New Roman" w:cs="Times New Roman"/>
-        </w:rPr>
-        <w:t xml:space="preserve"> traditional machine learning methods for </w:t>
-      </w:r>
-      <w:r>
-        <w:rPr>
-          <w:rFonts w:ascii="Times New Roman" w:hAnsi="Times New Roman" w:cs="Times New Roman"/>
-        </w:rPr>
-        <w:t>disease classification in medical image analysis</w:t>
-      </w:r>
-      <w:r>
-        <w:rPr>
-          <w:rFonts w:ascii="Times New Roman" w:hAnsi="Times New Roman" w:cs="Times New Roman"/>
-        </w:rPr>
-        <w:t xml:space="preserve">, which </w:t>
-      </w:r>
-      <w:r>
-        <w:rPr>
-          <w:rFonts w:ascii="Times New Roman" w:hAnsi="Times New Roman" w:cs="Times New Roman"/>
-        </w:rPr>
-        <w:t>rely on</w:t>
-      </w:r>
-      <w:r>
-        <w:rPr>
-          <w:rFonts w:ascii="Times New Roman" w:hAnsi="Times New Roman" w:cs="Times New Roman"/>
-        </w:rPr>
-        <w:t xml:space="preserve"> handcrafted features by experts </w:t>
+        <w:t xml:space="preserve">, there is a growing need for automated systems that can assist clinicians in interpreting these images. There already exist traditional machine learning methods for disease classification in medical image analysis, which rely on handcrafted features by experts </w:t>
       </w:r>
       <w:sdt>
         <w:sdtPr>
@@ -1679,25 +1683,7 @@
         <w:rPr>
           <w:rFonts w:ascii="Times New Roman" w:hAnsi="Times New Roman" w:cs="Times New Roman"/>
         </w:rPr>
-        <w:t>.</w:t>
-      </w:r>
-      <w:r>
-        <w:rPr>
-          <w:rFonts w:ascii="Times New Roman" w:hAnsi="Times New Roman" w:cs="Times New Roman"/>
-        </w:rPr>
-        <w:t xml:space="preserve"> </w:t>
-      </w:r>
-      <w:r>
-        <w:rPr>
-          <w:rFonts w:ascii="Times New Roman" w:hAnsi="Times New Roman" w:cs="Times New Roman"/>
-        </w:rPr>
-        <w:t xml:space="preserve">In contrast, deep learning approaches such as convolutional neural networks can automatically learn feature representations directly from raw image data, enabling them to detect subtle patterns </w:t>
-      </w:r>
-      <w:r>
-        <w:rPr>
-          <w:rFonts w:ascii="Times New Roman" w:hAnsi="Times New Roman" w:cs="Times New Roman"/>
-        </w:rPr>
-        <w:t xml:space="preserve">that may not be easily visible to the experts crafting handcrafted features </w:t>
+        <w:t xml:space="preserve">. In contrast, deep learning approaches such as convolutional neural networks can automatically learn feature representations directly from raw image data, enabling them to detect subtle patterns that may not be easily visible to the experts crafting handcrafted features </w:t>
       </w:r>
       <w:sdt>
         <w:sdtPr>
@@ -1745,31 +1731,7 @@
         <w:rPr>
           <w:rFonts w:ascii="Times New Roman" w:hAnsi="Times New Roman" w:cs="Times New Roman"/>
         </w:rPr>
-        <w:t>. Due to this</w:t>
-      </w:r>
-      <w:r>
-        <w:rPr>
-          <w:rFonts w:ascii="Times New Roman" w:hAnsi="Times New Roman" w:cs="Times New Roman"/>
-        </w:rPr>
-        <w:t>, deep learning models typically outperform classic machine learning models based on handcrafted features</w:t>
-      </w:r>
-      <w:r>
-        <w:rPr>
-          <w:rFonts w:ascii="Times New Roman" w:hAnsi="Times New Roman" w:cs="Times New Roman"/>
-        </w:rPr>
-        <w:t>,</w:t>
-      </w:r>
-      <w:r>
-        <w:rPr>
-          <w:rFonts w:ascii="Times New Roman" w:hAnsi="Times New Roman" w:cs="Times New Roman"/>
-        </w:rPr>
-        <w:t xml:space="preserve"> due to </w:t>
-      </w:r>
-      <w:r>
-        <w:rPr>
-          <w:rFonts w:ascii="Times New Roman" w:hAnsi="Times New Roman" w:cs="Times New Roman"/>
-        </w:rPr>
-        <w:t xml:space="preserve">learned features being extracted automatically to solve a specific task </w:t>
+        <w:t xml:space="preserve">. Due to this, deep learning models typically outperform classic machine learning models based on handcrafted features, due to learned features being extracted automatically to solve a specific task </w:t>
       </w:r>
       <w:sdt>
         <w:sdtPr>
@@ -1827,6 +1789,190 @@
           <w:rFonts w:ascii="Times New Roman" w:hAnsi="Times New Roman" w:cs="Times New Roman"/>
         </w:rPr>
       </w:pPr>
+      <w:r>
+        <w:rPr>
+          <w:rFonts w:ascii="Times New Roman" w:hAnsi="Times New Roman" w:cs="Times New Roman"/>
+        </w:rPr>
+        <w:t xml:space="preserve">There already exist some deep learning solutions for diagnosing pathologies from chest radiographs. One such solution is </w:t>
+      </w:r>
+      <w:proofErr w:type="spellStart"/>
+      <w:r>
+        <w:rPr>
+          <w:rFonts w:ascii="Times New Roman" w:hAnsi="Times New Roman" w:cs="Times New Roman"/>
+        </w:rPr>
+        <w:t>CheXNet</w:t>
+      </w:r>
+      <w:proofErr w:type="spellEnd"/>
+      <w:r>
+        <w:rPr>
+          <w:rFonts w:ascii="Times New Roman" w:hAnsi="Times New Roman" w:cs="Times New Roman"/>
+        </w:rPr>
+        <w:t xml:space="preserve">, a 121-layer convolutional neural network that </w:t>
+      </w:r>
+      <w:r>
+        <w:rPr>
+          <w:rFonts w:ascii="Times New Roman" w:hAnsi="Times New Roman" w:cs="Times New Roman"/>
+        </w:rPr>
+        <w:lastRenderedPageBreak/>
+        <w:t xml:space="preserve">outputs the probability of pneumonia based on a chest X-ray image as input </w:t>
+      </w:r>
+      <w:sdt>
+        <w:sdtPr>
+          <w:rPr>
+            <w:rFonts w:ascii="Times New Roman" w:hAnsi="Times New Roman" w:cs="Times New Roman"/>
+          </w:rPr>
+          <w:id w:val="-1702781731"/>
+          <w:citation/>
+        </w:sdtPr>
+        <w:sdtContent>
+          <w:r>
+            <w:rPr>
+              <w:rFonts w:ascii="Times New Roman" w:hAnsi="Times New Roman" w:cs="Times New Roman"/>
+            </w:rPr>
+            <w:fldChar w:fldCharType="begin"/>
+          </w:r>
+          <w:r>
+            <w:rPr>
+              <w:rFonts w:ascii="Times New Roman" w:hAnsi="Times New Roman" w:cs="Times New Roman"/>
+            </w:rPr>
+            <w:instrText xml:space="preserve"> CITATION Raj17 \l 2057 </w:instrText>
+          </w:r>
+          <w:r>
+            <w:rPr>
+              <w:rFonts w:ascii="Times New Roman" w:hAnsi="Times New Roman" w:cs="Times New Roman"/>
+            </w:rPr>
+            <w:fldChar w:fldCharType="separate"/>
+          </w:r>
+          <w:r>
+            <w:rPr>
+              <w:rFonts w:ascii="Times New Roman" w:hAnsi="Times New Roman" w:cs="Times New Roman"/>
+              <w:noProof/>
+            </w:rPr>
+            <w:t>(Rajpurkar, et al., 2017)</w:t>
+          </w:r>
+          <w:r>
+            <w:rPr>
+              <w:rFonts w:ascii="Times New Roman" w:hAnsi="Times New Roman" w:cs="Times New Roman"/>
+            </w:rPr>
+            <w:fldChar w:fldCharType="end"/>
+          </w:r>
+        </w:sdtContent>
+      </w:sdt>
+      <w:r>
+        <w:rPr>
+          <w:rFonts w:ascii="Times New Roman" w:hAnsi="Times New Roman" w:cs="Times New Roman"/>
+        </w:rPr>
+        <w:t>. A common weakness in deep learning solutions is a limited insight into the reasoning behind their predictions. In a medical context, results from these solutions will be interpreted by medical personnel who may not be proficient with technology, and thus this “</w:t>
+      </w:r>
+      <w:proofErr w:type="gramStart"/>
+      <w:r>
+        <w:rPr>
+          <w:rFonts w:ascii="Times New Roman" w:hAnsi="Times New Roman" w:cs="Times New Roman"/>
+        </w:rPr>
+        <w:t>black-box</w:t>
+      </w:r>
+      <w:proofErr w:type="gramEnd"/>
+      <w:r>
+        <w:rPr>
+          <w:rFonts w:ascii="Times New Roman" w:hAnsi="Times New Roman" w:cs="Times New Roman"/>
+        </w:rPr>
+        <w:t>” prediction can reduce trust in the validity of the result.</w:t>
+      </w:r>
+    </w:p>
+    <w:p>
+      <w:pPr>
+        <w:spacing w:line="360" w:lineRule="auto"/>
+        <w:rPr>
+          <w:rFonts w:ascii="Times New Roman" w:hAnsi="Times New Roman" w:cs="Times New Roman"/>
+        </w:rPr>
+      </w:pPr>
+      <w:r>
+        <w:rPr>
+          <w:rFonts w:ascii="Times New Roman" w:hAnsi="Times New Roman" w:cs="Times New Roman"/>
+        </w:rPr>
+        <w:t>The aim for this project is therefore not only to develop a deep learning model for chest X-ray classification, but also to extend existing approaches by incorporating uncertainty estimation and interpretability techniques. Methods such as Grad-CAM will be used to highlight image regions that contribute to model predictions, providing visual explanations that can support clinicians in understanding and validating the model’s output.</w:t>
+      </w:r>
+    </w:p>
+    <w:p>
+      <w:pPr>
+        <w:spacing w:line="360" w:lineRule="auto"/>
+        <w:rPr>
+          <w:rFonts w:ascii="Times New Roman" w:hAnsi="Times New Roman" w:cs="Times New Roman"/>
+        </w:rPr>
+      </w:pPr>
+      <w:r>
+        <w:rPr>
+          <w:rFonts w:ascii="Times New Roman" w:hAnsi="Times New Roman" w:cs="Times New Roman"/>
+        </w:rPr>
+        <w:t>To evaluate the success of the project, several quantitative metrics will be used. Since the task involves multi-label classification, performance will primarily be assessed using AUROC (Area Under the Receiver Operating Characteristic Curve) for each class, as well as the mean AUROC across all classes. In addition, metrics such as precision, recall, and F1-score will be evaluated to provide a comprehensive evaluation of model performance.</w:t>
+      </w:r>
+    </w:p>
+    <w:p>
+      <w:pPr>
+        <w:spacing w:line="360" w:lineRule="auto"/>
+        <w:rPr>
+          <w:rFonts w:ascii="Times New Roman" w:hAnsi="Times New Roman" w:cs="Times New Roman"/>
+          <w:lang w:val="nb-NO"/>
+        </w:rPr>
+      </w:pPr>
+      <w:r>
+        <w:rPr>
+          <w:rFonts w:ascii="Times New Roman" w:hAnsi="Times New Roman" w:cs="Times New Roman"/>
+        </w:rPr>
+        <w:t xml:space="preserve">There is no mathematical formula for interpretability. Due to its subjective nature, it will be difficult to provide an accurate metric for interpretability within the scope of this project. With more time and resources, we would ideally develop our model and allow health personnel to test it and give us feedback through a survey and semi-structured qualitative interviews. </w:t>
+      </w:r>
+      <w:r>
+        <w:rPr>
+          <w:rFonts w:ascii="Times New Roman" w:hAnsi="Times New Roman" w:cs="Times New Roman"/>
+          <w:highlight w:val="yellow"/>
+        </w:rPr>
+        <w:t>However, this task would be too large for the scope of this project, and thus we will instead show Grad-CAM heatmaps and compare correct predictions to incorrect predictions to assess whether the model focuses on clinically relevant regions.</w:t>
+      </w:r>
+      <w:r>
+        <w:rPr>
+          <w:rFonts w:ascii="Times New Roman" w:hAnsi="Times New Roman" w:cs="Times New Roman"/>
+        </w:rPr>
+        <w:t xml:space="preserve"> </w:t>
+      </w:r>
+      <w:r>
+        <w:rPr>
+          <w:rFonts w:ascii="Times New Roman" w:hAnsi="Times New Roman" w:cs="Times New Roman"/>
+          <w:lang w:val="nb-NO"/>
+        </w:rPr>
+        <w:t>&lt; skeptisk på denne. Det vurderer jo egentlig ikke f</w:t>
+      </w:r>
+      <w:r>
+        <w:rPr>
+          <w:rFonts w:ascii="Times New Roman" w:hAnsi="Times New Roman" w:cs="Times New Roman"/>
+          <w:lang w:val="nb-NO"/>
+        </w:rPr>
+        <w:t xml:space="preserve">orklarbarhet. Må komme tilbake til </w:t>
+      </w:r>
+      <w:proofErr w:type="spellStart"/>
+      <w:r>
+        <w:rPr>
+          <w:rFonts w:ascii="Times New Roman" w:hAnsi="Times New Roman" w:cs="Times New Roman"/>
+          <w:lang w:val="nb-NO"/>
+        </w:rPr>
+        <w:t>metrics</w:t>
+      </w:r>
+      <w:proofErr w:type="spellEnd"/>
+      <w:r>
+        <w:rPr>
+          <w:rFonts w:ascii="Times New Roman" w:hAnsi="Times New Roman" w:cs="Times New Roman"/>
+          <w:lang w:val="nb-NO"/>
+        </w:rPr>
+        <w:t xml:space="preserve"> for det.</w:t>
+      </w:r>
+    </w:p>
+    <w:p>
+      <w:pPr>
+        <w:spacing w:line="360" w:lineRule="auto"/>
+        <w:rPr>
+          <w:rFonts w:ascii="Times New Roman" w:hAnsi="Times New Roman" w:cs="Times New Roman"/>
+          <w:lang w:val="nb-NO"/>
+        </w:rPr>
+      </w:pPr>
     </w:p>
     <w:p>
       <w:pPr>
@@ -1834,7 +1980,6 @@
       </w:pPr>
       <w:bookmarkStart w:id="4" w:name="_Toc224811545"/>
       <w:r>
-        <w:lastRenderedPageBreak/>
         <w:t>Data</w:t>
       </w:r>
       <w:bookmarkEnd w:id="4"/>
@@ -2029,7 +2174,6 @@
                 <w:rPr>
                   <w:noProof/>
                 </w:rPr>
-                <w:lastRenderedPageBreak/>
                 <w:t xml:space="preserve">Klein, J. S., &amp; Rosado-de-Christenson, M. L. (2019). A Systematic Approach to Chest Radiographic Analysis. In J. Hodler, R. A. Kubik-Huch, &amp; G. K. von Schulthess, </w:t>
               </w:r>
               <w:r>
@@ -2102,6 +2246,7 @@
                 <w:rPr>
                   <w:noProof/>
                 </w:rPr>
+                <w:lastRenderedPageBreak/>
                 <w:t xml:space="preserve">Piper, K., Cox, S., Paterson, A., Thomas, A., Jeyagopal, N., &amp; Woznitza, N. (2014, May). Chest reporting by radiographers: Findings of an accredited postgraduate programme. </w:t>
               </w:r>
               <w:r>
@@ -4706,11 +4851,77 @@
     </b:Author>
     <b:RefOrder>5</b:RefOrder>
   </b:Source>
+  <b:Source>
+    <b:Tag>Raj17</b:Tag>
+    <b:SourceType>JournalArticle</b:SourceType>
+    <b:Guid>{B6014287-1B53-441F-9859-2A5C9FE95606}</b:Guid>
+    <b:Title>CheXNet: Radiologist-Level Pneumonia Detection on Chest X-Rays with Deep Learning</b:Title>
+    <b:JournalName>arXiv</b:JournalName>
+    <b:Year>2017</b:Year>
+    <b:Author>
+      <b:Author>
+        <b:NameList>
+          <b:Person>
+            <b:Last>Rajpurkar</b:Last>
+            <b:First>Pranav</b:First>
+          </b:Person>
+          <b:Person>
+            <b:Last>Irvin</b:Last>
+            <b:First>Jeremy</b:First>
+          </b:Person>
+          <b:Person>
+            <b:Last>Zhu</b:Last>
+            <b:First>Kaylie</b:First>
+          </b:Person>
+          <b:Person>
+            <b:Last>Yang</b:Last>
+            <b:First>Brandon</b:First>
+          </b:Person>
+          <b:Person>
+            <b:Last>Mehta</b:Last>
+            <b:First>Hershel</b:First>
+          </b:Person>
+          <b:Person>
+            <b:Last>Duan</b:Last>
+            <b:First>Tony</b:First>
+          </b:Person>
+          <b:Person>
+            <b:Last>Ding</b:Last>
+            <b:First>Daisy</b:First>
+          </b:Person>
+          <b:Person>
+            <b:Last>Bagul</b:Last>
+            <b:First>Aarti</b:First>
+          </b:Person>
+          <b:Person>
+            <b:Last>Langlotz</b:Last>
+            <b:First>Curtis</b:First>
+          </b:Person>
+          <b:Person>
+            <b:Last>Shpanskaya</b:Last>
+            <b:First>Katie</b:First>
+          </b:Person>
+          <b:Person>
+            <b:Last>Lungren</b:Last>
+            <b:Middle>P</b:Middle>
+            <b:First>Matthew</b:First>
+          </b:Person>
+          <b:Person>
+            <b:Last>Ng</b:Last>
+            <b:Middle>Y</b:Middle>
+            <b:First>Andrew</b:First>
+          </b:Person>
+        </b:NameList>
+      </b:Author>
+    </b:Author>
+    <b:DOI>https://doi.org/10.48550/arXiv.1711.05225</b:DOI>
+    <b:RefOrder>7</b:RefOrder>
+  </b:Source>
 </b:Sources>
 </file>
 
 <file path=customXml/itemProps1.xml><?xml version="1.0" encoding="utf-8"?>
-<ds:datastoreItem xmlns:ds="http://schemas.openxmlformats.org/officeDocument/2006/customXml" ds:itemID="{FC376942-E7F9-4CA3-B573-F0899B785612}">
+<ds:datastoreItem xmlns:ds="http://schemas.openxmlformats.org/officeDocument/2006/customXml" ds:itemID="{BF7FE501-64FE-4169-8CB6-0587F1475AB6}">
   <ds:schemaRefs>
     <ds:schemaRef ds:uri="http://schemas.openxmlformats.org/officeDocument/2006/bibliography"/>
   </ds:schemaRefs>

</xml_diff>